<commit_message>
Define single-step paper buy and sell decisions
</commit_message>
<xml_diff>
--- a/مستند-پروژه-جک.docx
+++ b/مستند-پروژه-جک.docx
@@ -4913,6 +4913,75 @@
         <w:t>محدودیت‌های پیش‌بینی‌شده: تغییر ساختار سایت، CAPTCHA، ورود دومرحله‌ای، قطع اینترنت و دادهٔ ناقص می‌توانند اجرای خودکار را متوقف کنند. در این شرایط وضعیت خطا یا DATA_BLOCKED گزارش می‌شود. API نداشتن سامانهٔ بورسی فقط به روش دریافت پرتفوی مربوط است و روش اجرای مدل هوش مصنوعی را تعیین نمی‌کند.</w:t>
       </w:r>
     </w:p>
+    <w:p>
+      <w:pPr>
+        <w:pStyle w:val="Heading1"/>
+        <w:keepNext/>
+        <w:bidi/>
+        <w:jc w:val="right"/>
+      </w:pPr>
+      <w:r>
+        <w:rPr>
+          <w:rFonts w:ascii="Vazirmatn" w:hAnsi="Vazirmatn" w:cs="Vazirmatn"/>
+          <w:b/>
+          <w:color w:val="2E74B5"/>
+          <w:sz w:val="32"/>
+          <w:rtl w:val="1"/>
+        </w:rPr>
+        <w:t>۱۶. نتیجهٔ نهایی و پلهٔ محدود</w:t>
+      </w:r>
+    </w:p>
+    <w:p>
+      <w:pPr>
+        <w:bidi/>
+        <w:spacing w:after="120" w:line="288" w:lineRule="auto"/>
+        <w:jc w:val="right"/>
+      </w:pPr>
+      <w:r>
+        <w:rPr>
+          <w:rFonts w:ascii="Vazirmatn" w:hAnsi="Vazirmatn" w:cs="Vazirmatn"/>
+          <w:b w:val="0"/>
+          <w:color w:val="000000"/>
+          <w:sz w:val="22"/>
+          <w:rtl w:val="1"/>
+        </w:rPr>
+        <w:t>نظر نهایی جک برای هر نماد برآیند شواهد ایجنت‌های تابلو، تکنیکال، بنیادی، رویدادها و ریسک است؛ جمع سادهٔ رأی‌ها نیست. خروجی کاربرپسند برای هر نماد یکی از چهار حالت خرید آزمایشی، فروش آزمایشی، نگهداری / واچ‌لیست یا عدم اعلام نظر است. حالت آخر در دادهٔ ناقص، قدیمی، متناقض یا ناکافی اجباری است.</w:t>
+      </w:r>
+    </w:p>
+    <w:p>
+      <w:pPr>
+        <w:bidi/>
+        <w:spacing w:after="120" w:line="288" w:lineRule="auto"/>
+        <w:jc w:val="right"/>
+      </w:pPr>
+      <w:r>
+        <w:rPr>
+          <w:rFonts w:ascii="Vazirmatn" w:hAnsi="Vazirmatn" w:cs="Vazirmatn"/>
+          <w:b w:val="0"/>
+          <w:color w:val="000000"/>
+          <w:sz w:val="22"/>
+          <w:rtl w:val="1"/>
+        </w:rPr>
+        <w:t>خرید یا فروش فقط یک پلهٔ محدود دارد. جک حداکثر اندازهٔ همان پله را بر اساس بودجهٔ ریسک، فاصله تا حد زیان، کارمزد، لغزش، سرمایهٔ آزاد، محدودیت تمرکز و نقدشوندگی محاسبه و نمایش می‌دهد. افزایش خودکار موقعیت، سفارش چندپله‌ای، میانگین کم‌کردن و اجرای مالی واقعی خارج از دامنه است.</w:t>
+      </w:r>
+    </w:p>
+    <w:p>
+      <w:pPr>
+        <w:bidi/>
+        <w:spacing w:after="120" w:line="288" w:lineRule="auto"/>
+        <w:jc w:val="right"/>
+      </w:pPr>
+      <w:r>
+        <w:rPr>
+          <w:rFonts w:ascii="Vazirmatn" w:hAnsi="Vazirmatn" w:cs="Vazirmatn"/>
+          <w:b w:val="0"/>
+          <w:color w:val="000000"/>
+          <w:sz w:val="22"/>
+          <w:rtl w:val="1"/>
+        </w:rPr>
+        <w:t>نتیجه شامل شرط تأیید، شرط ابطال، شواهد موافق و مخالف، منبع و زمان داده و تأیید انسانی است. این نتیجه فقط برای محیط آزمایشی است و به سفارش واقعی تبدیل نمی‌شود.</w:t>
+      </w:r>
+    </w:p>
     <w:sectPr>
       <w:footerReference w:type="default" r:id="rId9"/>
       <w:pgSz w:w="12240" w:h="15840"/>

</xml_diff>

<commit_message>
Add chart control agent and indicator workflow
</commit_message>
<xml_diff>
--- a/مستند-پروژه-جک.docx
+++ b/مستند-پروژه-جک.docx
@@ -4982,6 +4982,75 @@
         <w:t>نتیجه شامل شرط تأیید، شرط ابطال، شواهد موافق و مخالف، منبع و زمان داده و تأیید انسانی است. این نتیجه فقط برای محیط آزمایشی است و به سفارش واقعی تبدیل نمی‌شود.</w:t>
       </w:r>
     </w:p>
+    <w:p>
+      <w:pPr>
+        <w:pStyle w:val="Heading1"/>
+        <w:keepNext/>
+        <w:bidi/>
+        <w:jc w:val="right"/>
+      </w:pPr>
+      <w:r>
+        <w:rPr>
+          <w:rFonts w:ascii="Vazirmatn" w:hAnsi="Vazirmatn" w:cs="Vazirmatn"/>
+          <w:b/>
+          <w:color w:val="2E74B5"/>
+          <w:sz w:val="32"/>
+          <w:rtl w:val="1"/>
+        </w:rPr>
+        <w:t>۱۷. کنترل نمودار و افزودن اندیکاتور</w:t>
+      </w:r>
+    </w:p>
+    <w:p>
+      <w:pPr>
+        <w:bidi/>
+        <w:spacing w:after="120" w:line="288" w:lineRule="auto"/>
+        <w:jc w:val="right"/>
+      </w:pPr>
+      <w:r>
+        <w:rPr>
+          <w:rFonts w:ascii="Vazirmatn" w:hAnsi="Vazirmatn" w:cs="Vazirmatn"/>
+          <w:b w:val="0"/>
+          <w:color w:val="000000"/>
+          <w:sz w:val="22"/>
+          <w:rtl w:val="1"/>
+        </w:rPr>
+        <w:t>ایجنت کنترل نمودار پس از ورود دستی کاربر، نماد، تایم‌فریم و اندیکاتور درخواستی را در سایت نموداری تأییدشده باز و تنظیم می‌کند. نام سایت، زمان دریافت، نماد، تایم‌فریم، نام اندیکاتور و پارامترهای اعمال‌شده در گزارش ثبت می‌شوند.</w:t>
+      </w:r>
+    </w:p>
+    <w:p>
+      <w:pPr>
+        <w:bidi/>
+        <w:spacing w:after="120" w:line="288" w:lineRule="auto"/>
+        <w:jc w:val="right"/>
+      </w:pPr>
+      <w:r>
+        <w:rPr>
+          <w:rFonts w:ascii="Vazirmatn" w:hAnsi="Vazirmatn" w:cs="Vazirmatn"/>
+          <w:b w:val="0"/>
+          <w:color w:val="000000"/>
+          <w:sz w:val="22"/>
+          <w:rtl w:val="1"/>
+        </w:rPr>
+        <w:t>انتخاب خودکار اندیکاتور فقط از فهرست مجاز و با دلیل ثبت‌شده بر پایهٔ نوع تحلیل، تایم‌فریم و دادهٔ موجود انجام می‌شود. RSI، MACD، میانگین متحرک، ایچیموکو و ATR نمونه‌های اولیه‌اند. اگر دادهٔ OHLCV معتبر وجود دارد، محاسبهٔ مستقل در هستهٔ پایتون مرجع کنترل مقدارهای نمودار است.</w:t>
+      </w:r>
+    </w:p>
+    <w:p>
+      <w:pPr>
+        <w:bidi/>
+        <w:spacing w:after="120" w:line="288" w:lineRule="auto"/>
+        <w:jc w:val="right"/>
+      </w:pPr>
+      <w:r>
+        <w:rPr>
+          <w:rFonts w:ascii="Vazirmatn" w:hAnsi="Vazirmatn" w:cs="Vazirmatn"/>
+          <w:b w:val="0"/>
+          <w:color w:val="000000"/>
+          <w:sz w:val="22"/>
+          <w:rtl w:val="1"/>
+        </w:rPr>
+        <w:t>اگر منوی سایت تغییر کند، اندیکاتور در دسترس نباشد، نمودار خوانا نباشد یا دادهٔ نمودار با دادهٔ OHLCV ناسازگار باشد، ایجنت باید DATA_BLOCKED یا اختلاف منبع اعلام کند. ورود، CAPTCHA و احراز هویت دومرحله‌ای با کاربر است. تعامل ایجنت با صفحهٔ کارگزاری فقط‌خواندنی است و هیچ اقدام مالی انجام نمی‌شود.</w:t>
+      </w:r>
+    </w:p>
     <w:sectPr>
       <w:footerReference w:type="default" r:id="rId9"/>
       <w:pgSz w:w="12240" w:h="15840"/>

</xml_diff>

<commit_message>
Set Iran market schedule for local analysis
</commit_message>
<xml_diff>
--- a/مستند-پروژه-جک.docx
+++ b/مستند-پروژه-جک.docx
@@ -5051,6 +5051,58 @@
         <w:t>اگر منوی سایت تغییر کند، اندیکاتور در دسترس نباشد، نمودار خوانا نباشد یا دادهٔ نمودار با دادهٔ OHLCV ناسازگار باشد، ایجنت باید DATA_BLOCKED یا اختلاف منبع اعلام کند. ورود، CAPTCHA و احراز هویت دومرحله‌ای با کاربر است. تعامل ایجنت با صفحهٔ کارگزاری فقط‌خواندنی است و هیچ اقدام مالی انجام نمی‌شود.</w:t>
       </w:r>
     </w:p>
+    <w:p>
+      <w:pPr>
+        <w:pStyle w:val="Heading2"/>
+        <w:keepNext/>
+        <w:bidi/>
+        <w:jc w:val="right"/>
+      </w:pPr>
+      <w:r>
+        <w:rPr>
+          <w:rFonts w:ascii="Vazirmatn" w:hAnsi="Vazirmatn" w:cs="Vazirmatn"/>
+          <w:b/>
+          <w:color w:val="2E74B5"/>
+          <w:sz w:val="26"/>
+          <w:rtl w:val="1"/>
+        </w:rPr>
+        <w:t>تقویم و زمان‌بندی بورس ایران</w:t>
+      </w:r>
+    </w:p>
+    <w:p>
+      <w:pPr>
+        <w:bidi/>
+        <w:spacing w:after="120" w:line="288" w:lineRule="auto"/>
+        <w:jc w:val="right"/>
+      </w:pPr>
+      <w:r>
+        <w:rPr>
+          <w:rFonts w:ascii="Vazirmatn" w:hAnsi="Vazirmatn" w:cs="Vazirmatn"/>
+          <w:b w:val="0"/>
+          <w:color w:val="000000"/>
+          <w:sz w:val="22"/>
+          <w:rtl w:val="1"/>
+        </w:rPr>
+        <w:t>برای بازار سهام بورس و فرابورس ایران، زمان‌بندی پایهٔ جک شنبه تا چهارشنبه، جلسهٔ اصلی معاملات از ۰۹:۰۰ تا ۱۲:۳۰ به منطقهٔ زمانی Asia/Tehran است. پیش‌گشایش حدود ۰۸:۴۵ و مرحلهٔ معاملات پایانی برای برخی نمادها ۱۲:۴۵ تا ۱۳:۰۰ است. این زمان‌ها باید در تنظیمات قابل‌اصلاح باشند؛ تعطیلات رسمی، توقف نماد، اطلاعیهٔ بازار و تغییر مقررات بر برنامهٔ پایه مقدم‌اند.</w:t>
+      </w:r>
+    </w:p>
+    <w:p>
+      <w:pPr>
+        <w:bidi/>
+        <w:spacing w:after="120" w:line="288" w:lineRule="auto"/>
+        <w:jc w:val="right"/>
+      </w:pPr>
+      <w:r>
+        <w:rPr>
+          <w:rFonts w:ascii="Vazirmatn" w:hAnsi="Vazirmatn" w:cs="Vazirmatn"/>
+          <w:b w:val="0"/>
+          <w:color w:val="000000"/>
+          <w:sz w:val="22"/>
+          <w:rtl w:val="1"/>
+        </w:rPr>
+        <w:t>زمان‌بند فقط در پنجره‌های تعیین‌شده تحلیل تازه و پایش بازار را اجرا می‌کند. بیرون از ساعت بازار، آخرین دادهٔ بازار زنده تلقی نمی‌شود؛ جک فقط گزارش‌های قبلی را نمایش می‌دهد یا برای اجرای بعدی آماده می‌شود. در روز تعطیل یا وقتی تقویم/وضعیت بازار نامشخص است، اجرای تحلیلی با MARKET_CLOSED یا DATA_BLOCKED ثبت می‌شود.</w:t>
+      </w:r>
+    </w:p>
     <w:sectPr>
       <w:footerReference w:type="default" r:id="rId9"/>
       <w:pgSz w:w="12240" w:h="15840"/>

</xml_diff>

<commit_message>
Add final analysis quality supervisor
</commit_message>
<xml_diff>
--- a/مستند-پروژه-جک.docx
+++ b/مستند-پروژه-جک.docx
@@ -5,11 +5,16 @@
     <w:p>
       <w:pPr>
         <w:bidi/>
+        <w:spacing w:after="120" w:line="288" w:lineRule="auto"/>
+        <w:jc w:val="right"/>
       </w:pPr>
       <w:r>
         <w:rPr>
-          <w:rtl/>
           <w:rFonts w:ascii="Vazirmatn" w:hAnsi="Vazirmatn" w:cs="Vazirmatn"/>
+          <w:b w:val="0"/>
+          <w:color w:val="000000"/>
+          <w:sz w:val="22"/>
+          <w:rtl w:val="1"/>
         </w:rPr>
         <w:t>پروزه اتوماسیون بورسی</w:t>
       </w:r>
@@ -893,6 +898,51 @@
                 <w:sz w:val="22"/>
                 <w:rtl w:val="1"/>
               </w:rPr>
+              <w:t>ایجنت ناظر کیفیت</w:t>
+            </w:r>
+          </w:p>
+        </w:tc>
+        <w:tc>
+          <w:tcPr>
+            <w:tcW w:type="dxa" w:w="6860"/>
+            <w:shd w:fill="F2F4F7"/>
+          </w:tcPr>
+          <w:p>
+            <w:pPr>
+              <w:bidi/>
+              <w:jc w:val="right"/>
+            </w:pPr>
+            <w:r>
+              <w:rPr>
+                <w:rFonts w:ascii="Vazirmatn" w:hAnsi="Vazirmatn" w:cs="Vazirmatn"/>
+                <w:b w:val="0"/>
+                <w:color w:val="000000"/>
+                <w:sz w:val="22"/>
+                <w:rtl w:val="1"/>
+              </w:rPr>
+              <w:t>کنترل نهایی داده، امتیازدهی، خطاها و قابلیت ردیابی پیش از تحویل بسته به جک.</w:t>
+            </w:r>
+          </w:p>
+        </w:tc>
+      </w:tr>
+      <w:tr>
+        <w:tc>
+          <w:tcPr>
+            <w:tcW w:type="dxa" w:w="2500"/>
+          </w:tcPr>
+          <w:p>
+            <w:pPr>
+              <w:bidi/>
+              <w:jc w:val="right"/>
+            </w:pPr>
+            <w:r>
+              <w:rPr>
+                <w:rFonts w:ascii="Vazirmatn" w:hAnsi="Vazirmatn" w:cs="Vazirmatn"/>
+                <w:b w:val="0"/>
+                <w:color w:val="000000"/>
+                <w:sz w:val="22"/>
+                <w:rtl w:val="1"/>
+              </w:rPr>
               <w:t>مدل جمع‌بند</w:t>
             </w:r>
           </w:p>
@@ -900,7 +950,6 @@
         <w:tc>
           <w:tcPr>
             <w:tcW w:type="dxa" w:w="6860"/>
-            <w:shd w:fill="F2F4F7"/>
           </w:tcPr>
           <w:p>
             <w:pPr>
@@ -924,6 +973,7 @@
         <w:tc>
           <w:tcPr>
             <w:tcW w:type="dxa" w:w="2500"/>
+            <w:shd w:fill="F2F4F7"/>
           </w:tcPr>
           <w:p>
             <w:pPr>
@@ -945,6 +995,7 @@
         <w:tc>
           <w:tcPr>
             <w:tcW w:type="dxa" w:w="6860"/>
+            <w:shd w:fill="F2F4F7"/>
           </w:tcPr>
           <w:p>
             <w:pPr>
@@ -1088,6 +1139,24 @@
           <w:sz w:val="22"/>
           <w:rtl w:val="1"/>
         </w:rPr>
+        <w:t>ایجنت ناظر کیفیت، داده، امتیازدهی و تعارض‌ها را کنترل می‌کند و فقط بستهٔ QA_PASSED را به جک می‌فرستد.</w:t>
+      </w:r>
+    </w:p>
+    <w:p>
+      <w:pPr>
+        <w:pStyle w:val="ListNumber"/>
+        <w:bidi/>
+        <w:spacing w:after="80" w:line="288" w:lineRule="auto"/>
+        <w:jc w:val="right"/>
+      </w:pPr>
+      <w:r>
+        <w:rPr>
+          <w:rFonts w:ascii="Vazirmatn" w:hAnsi="Vazirmatn" w:cs="Vazirmatn"/>
+          <w:b w:val="0"/>
+          <w:color w:val="000000"/>
+          <w:sz w:val="22"/>
+          <w:rtl w:val="1"/>
+        </w:rPr>
         <w:t>مدل جمع‌بند، گزارش هر نماد و گزارش سطح پرتفوی را می‌سازد.</w:t>
       </w:r>
     </w:p>
@@ -1125,92 +1194,6 @@
           <w:rtl w:val="1"/>
         </w:rPr>
         <w:t>۵. معماری منطقی</w:t>
-      </w:r>
-    </w:p>
-    <w:p>
-      <w:pPr>
-        <w:pStyle w:val="Heading2"/>
-        <w:keepNext/>
-        <w:bidi/>
-        <w:jc w:val="right"/>
-      </w:pPr>
-      <w:r>
-        <w:rPr>
-          <w:rFonts w:ascii="Vazirmatn" w:hAnsi="Vazirmatn" w:cs="Vazirmatn"/>
-          <w:b/>
-          <w:color w:val="2E74B5"/>
-          <w:sz w:val="26"/>
-          <w:rtl w:val="1"/>
-        </w:rPr>
-        <w:t>تصمیم‌های قطعی دریافت و اجرا</w:t>
-      </w:r>
-    </w:p>
-    <w:p>
-      <w:pPr>
-        <w:bidi/>
-        <w:spacing w:after="120" w:line="288" w:lineRule="auto"/>
-        <w:jc w:val="right"/>
-      </w:pPr>
-      <w:r>
-        <w:rPr>
-          <w:rFonts w:ascii="Vazirmatn" w:hAnsi="Vazirmatn" w:cs="Vazirmatn"/>
-          <w:b w:val="0"/>
-          <w:color w:val="000000"/>
-          <w:sz w:val="22"/>
-          <w:rtl w:val="1"/>
-        </w:rPr>
-        <w:t>سامانهٔ بورسی طبق اعلام مالک پروژه API ندارد. دریافت پرتفوی از رابط مرورگر پس از ورود دستی کاربر انجام می‌شود. نام و آدرس سامانه هنوز لازم است. جزئیات روش استخراج بعد از مشاهدهٔ صفحه تعیین می‌شود.</w:t>
-      </w:r>
-    </w:p>
-    <w:p>
-      <w:pPr>
-        <w:bidi/>
-        <w:spacing w:after="120" w:line="288" w:lineRule="auto"/>
-        <w:jc w:val="right"/>
-      </w:pPr>
-      <w:r>
-        <w:rPr>
-          <w:rFonts w:ascii="Vazirmatn" w:hAnsi="Vazirmatn" w:cs="Vazirmatn"/>
-          <w:b w:val="0"/>
-          <w:color w:val="000000"/>
-          <w:sz w:val="22"/>
-          <w:rtl w:val="1"/>
-        </w:rPr>
-        <w:t>کاربرد شخصی است و هر دو هسته روی کامپیوتر محل کار یا لپ‌تاپ منزل اجرا می‌شوند؛ سرور ابری یا رایانهٔ همیشه‌روشن در نیاز فعلی وجود ندارد. رابط از localhost باز می‌شود. تنظیمات اجرا باید قابل‌انتقال و مسیرها نسبت به ریشهٔ پروژه باشند؛ محل فعلی همهٔ فایل‌ها F:\Automasion است. ورود کاربر روی هر دستگاه جداگانه انجام می‌شود و نشست مرورگر بین دستگاه‌ها منتقل نمی‌شود.</w:t>
-      </w:r>
-    </w:p>
-    <w:p>
-      <w:pPr>
-        <w:bidi/>
-        <w:spacing w:after="120" w:line="288" w:lineRule="auto"/>
-        <w:jc w:val="right"/>
-      </w:pPr>
-      <w:r>
-        <w:rPr>
-          <w:rFonts w:ascii="Vazirmatn" w:hAnsi="Vazirmatn" w:cs="Vazirmatn"/>
-          <w:b w:val="0"/>
-          <w:color w:val="000000"/>
-          <w:sz w:val="22"/>
-          <w:rtl w:val="1"/>
-        </w:rPr>
-        <w:t>ارتباط داخلی رابط HTML و هستهٔ پایتون مستقل از API سامانهٔ بورسی است. انتخاب مدل هوش مصنوعی و اجرای آن به‌صورت محلی یا از طریق API هنوز باز است. اجرای لوکال برنامه به معنی بی‌نیازی از اینترنت برای دریافت دادهٔ سایت نیست.</w:t>
-      </w:r>
-    </w:p>
-    <w:p>
-      <w:pPr>
-        <w:bidi/>
-        <w:spacing w:after="120" w:line="288" w:lineRule="auto"/>
-        <w:jc w:val="right"/>
-      </w:pPr>
-      <w:r>
-        <w:rPr>
-          <w:rFonts w:ascii="Vazirmatn" w:hAnsi="Vazirmatn" w:cs="Vazirmatn"/>
-          <w:b w:val="0"/>
-          <w:color w:val="000000"/>
-          <w:sz w:val="22"/>
-          <w:rtl w:val="1"/>
-        </w:rPr>
-        <w:t>در پایان هر مرحله کدها، مستندات و اسکیل‌ها در GitHub ثبت و ارسال شوند. اطلاعات ورود، کلیدها، نشست‌ها و داده‌های شخصی پرتفوی از انتشار مستثنا باشند. مخزن معرفی‌شدهٔ مالک پروژه https://github.com/bahrami05-meh/Automation.git و شاخهٔ پایه main است. وضعیت ارسال از تاریخچهٔ Git بررسی شود. انتقال کد بین دو دستگاه از انتقال داده‌های خصوصی مستقل است.</w:t>
       </w:r>
     </w:p>
     <w:p>
@@ -1769,7 +1752,7 @@
                 <w:sz w:val="22"/>
                 <w:rtl w:val="1"/>
               </w:rPr>
-              <w:t>مدل جمع‌بند</w:t>
+              <w:t>نظارت کیفیت</w:t>
             </w:r>
           </w:p>
         </w:tc>
@@ -1791,6 +1774,72 @@
                 <w:sz w:val="22"/>
                 <w:rtl w:val="1"/>
               </w:rPr>
+              <w:t>بازاجرای امتیاز، کنترل واحد/زمان/منبع و تعارض‌ها</w:t>
+            </w:r>
+          </w:p>
+        </w:tc>
+        <w:tc>
+          <w:tcPr>
+            <w:tcW w:type="dxa" w:w="3160"/>
+            <w:shd w:fill="F2F4F7"/>
+          </w:tcPr>
+          <w:p>
+            <w:pPr>
+              <w:bidi/>
+              <w:jc w:val="right"/>
+            </w:pPr>
+            <w:r>
+              <w:rPr>
+                <w:rFonts w:ascii="Vazirmatn" w:hAnsi="Vazirmatn" w:cs="Vazirmatn"/>
+                <w:b w:val="0"/>
+                <w:color w:val="000000"/>
+                <w:sz w:val="22"/>
+                <w:rtl w:val="1"/>
+              </w:rPr>
+              <w:t>QA_PASSED یا ارجاع خطا / مسدودسازی</w:t>
+            </w:r>
+          </w:p>
+        </w:tc>
+      </w:tr>
+      <w:tr>
+        <w:tc>
+          <w:tcPr>
+            <w:tcW w:type="dxa" w:w="1900"/>
+          </w:tcPr>
+          <w:p>
+            <w:pPr>
+              <w:bidi/>
+              <w:jc w:val="right"/>
+            </w:pPr>
+            <w:r>
+              <w:rPr>
+                <w:rFonts w:ascii="Vazirmatn" w:hAnsi="Vazirmatn" w:cs="Vazirmatn"/>
+                <w:b w:val="0"/>
+                <w:color w:val="000000"/>
+                <w:sz w:val="22"/>
+                <w:rtl w:val="1"/>
+              </w:rPr>
+              <w:t>مدل جمع‌بند</w:t>
+            </w:r>
+          </w:p>
+        </w:tc>
+        <w:tc>
+          <w:tcPr>
+            <w:tcW w:type="dxa" w:w="4300"/>
+          </w:tcPr>
+          <w:p>
+            <w:pPr>
+              <w:bidi/>
+              <w:jc w:val="right"/>
+            </w:pPr>
+            <w:r>
+              <w:rPr>
+                <w:rFonts w:ascii="Vazirmatn" w:hAnsi="Vazirmatn" w:cs="Vazirmatn"/>
+                <w:b w:val="0"/>
+                <w:color w:val="000000"/>
+                <w:sz w:val="22"/>
+                <w:rtl w:val="1"/>
+              </w:rPr>
               <w:t>حل تعارض، رتبه‌بندی ریسک، تولید متن فارسی</w:t>
             </w:r>
           </w:p>
@@ -1798,7 +1847,6 @@
         <w:tc>
           <w:tcPr>
             <w:tcW w:type="dxa" w:w="3160"/>
-            <w:shd w:fill="F2F4F7"/>
           </w:tcPr>
           <w:p>
             <w:pPr>
@@ -1822,6 +1870,7 @@
         <w:tc>
           <w:tcPr>
             <w:tcW w:type="dxa" w:w="1900"/>
+            <w:shd w:fill="F2F4F7"/>
           </w:tcPr>
           <w:p>
             <w:pPr>
@@ -1843,6 +1892,7 @@
         <w:tc>
           <w:tcPr>
             <w:tcW w:type="dxa" w:w="4300"/>
+            <w:shd w:fill="F2F4F7"/>
           </w:tcPr>
           <w:p>
             <w:pPr>
@@ -1864,6 +1914,7 @@
         <w:tc>
           <w:tcPr>
             <w:tcW w:type="dxa" w:w="3160"/>
+            <w:shd w:fill="F2F4F7"/>
           </w:tcPr>
           <w:p>
             <w:pPr>
@@ -2336,6 +2387,74 @@
           </w:p>
         </w:tc>
       </w:tr>
+      <w:tr>
+        <w:tc>
+          <w:tcPr>
+            <w:tcW w:type="dxa" w:w="1700"/>
+            <w:shd w:fill="F2F4F7"/>
+          </w:tcPr>
+          <w:p>
+            <w:pPr>
+              <w:bidi/>
+              <w:jc w:val="right"/>
+            </w:pPr>
+            <w:r>
+              <w:rPr>
+                <w:rFonts w:ascii="Vazirmatn" w:hAnsi="Vazirmatn" w:cs="Vazirmatn"/>
+                <w:b w:val="0"/>
+                <w:color w:val="000000"/>
+                <w:sz w:val="22"/>
+                <w:rtl w:val="1"/>
+              </w:rPr>
+              <w:t>ناظر کیفیت</w:t>
+            </w:r>
+          </w:p>
+        </w:tc>
+        <w:tc>
+          <w:tcPr>
+            <w:tcW w:type="dxa" w:w="3650"/>
+            <w:shd w:fill="F2F4F7"/>
+          </w:tcPr>
+          <w:p>
+            <w:pPr>
+              <w:bidi/>
+              <w:jc w:val="right"/>
+            </w:pPr>
+            <w:r>
+              <w:rPr>
+                <w:rFonts w:ascii="Vazirmatn" w:hAnsi="Vazirmatn" w:cs="Vazirmatn"/>
+                <w:b w:val="0"/>
+                <w:color w:val="000000"/>
+                <w:sz w:val="22"/>
+                <w:rtl w:val="1"/>
+              </w:rPr>
+              <w:t>بستهٔ داده، خروجی ایجنت‌ها، قواعد امتیاز و خروجی ریسک</w:t>
+            </w:r>
+          </w:p>
+        </w:tc>
+        <w:tc>
+          <w:tcPr>
+            <w:tcW w:type="dxa" w:w="4010"/>
+            <w:shd w:fill="F2F4F7"/>
+          </w:tcPr>
+          <w:p>
+            <w:pPr>
+              <w:bidi/>
+              <w:jc w:val="right"/>
+            </w:pPr>
+            <w:r>
+              <w:rPr>
+                <w:rFonts w:ascii="Vazirmatn" w:hAnsi="Vazirmatn" w:cs="Vazirmatn"/>
+                <w:b w:val="0"/>
+                <w:color w:val="000000"/>
+                <w:sz w:val="22"/>
+                <w:rtl w:val="1"/>
+              </w:rPr>
+              <w:t>QA_PASSED، QA_RETRY یا QA_BLOCKED همراه با خطای قابل‌ردیابی</w:t>
+            </w:r>
+          </w:p>
+        </w:tc>
+      </w:tr>
     </w:tbl>
     <w:p>
       <w:pPr>
@@ -2737,6 +2856,71 @@
                 <w:rtl w:val="1"/>
               </w:rPr>
               <w:t>برای بازبینی بعدی ثبت می‌شود.</w:t>
+            </w:r>
+          </w:p>
+        </w:tc>
+      </w:tr>
+      <w:tr>
+        <w:tc>
+          <w:tcPr>
+            <w:tcW w:type="dxa" w:w="2200"/>
+          </w:tcPr>
+          <w:p>
+            <w:pPr>
+              <w:bidi/>
+              <w:jc w:val="right"/>
+            </w:pPr>
+            <w:r>
+              <w:rPr>
+                <w:rFonts w:ascii="Vazirmatn" w:hAnsi="Vazirmatn" w:cs="Vazirmatn"/>
+                <w:b w:val="0"/>
+                <w:color w:val="000000"/>
+                <w:sz w:val="22"/>
+                <w:rtl w:val="1"/>
+              </w:rPr>
+              <w:t>QA_BLOCKED</w:t>
+            </w:r>
+          </w:p>
+        </w:tc>
+        <w:tc>
+          <w:tcPr>
+            <w:tcW w:type="dxa" w:w="4200"/>
+          </w:tcPr>
+          <w:p>
+            <w:pPr>
+              <w:bidi/>
+              <w:jc w:val="right"/>
+            </w:pPr>
+            <w:r>
+              <w:rPr>
+                <w:rFonts w:ascii="Vazirmatn" w:hAnsi="Vazirmatn" w:cs="Vazirmatn"/>
+                <w:b w:val="0"/>
+                <w:color w:val="000000"/>
+                <w:sz w:val="22"/>
+                <w:rtl w:val="1"/>
+              </w:rPr>
+              <w:t>کنترل نهایی نقص یا تناقض غیرقابل‌رفع یافته است.</w:t>
+            </w:r>
+          </w:p>
+        </w:tc>
+        <w:tc>
+          <w:tcPr>
+            <w:tcW w:type="dxa" w:w="2960"/>
+          </w:tcPr>
+          <w:p>
+            <w:pPr>
+              <w:bidi/>
+              <w:jc w:val="right"/>
+            </w:pPr>
+            <w:r>
+              <w:rPr>
+                <w:rFonts w:ascii="Vazirmatn" w:hAnsi="Vazirmatn" w:cs="Vazirmatn"/>
+                <w:b w:val="0"/>
+                <w:color w:val="000000"/>
+                <w:sz w:val="22"/>
+                <w:rtl w:val="1"/>
+              </w:rPr>
+              <w:t>بسته به مدل جمع‌بند تحویل نمی‌شود؛ عدم اعلام نظر گزارش می‌شود.</w:t>
             </w:r>
           </w:p>
         </w:tc>
@@ -3354,6 +3538,24 @@
           <w:rtl w:val="1"/>
         </w:rPr>
         <w:t>برای هر نماد حداقل سه بخش تحلیل و یک بخش کنترل کیفیت داده در گزارش حاضر باشد.</w:t>
+      </w:r>
+    </w:p>
+    <w:p>
+      <w:pPr>
+        <w:pStyle w:val="ListBullet"/>
+        <w:bidi/>
+        <w:spacing w:after="80" w:line="288" w:lineRule="auto"/>
+        <w:jc w:val="right"/>
+      </w:pPr>
+      <w:r>
+        <w:rPr>
+          <w:rFonts w:ascii="Vazirmatn" w:hAnsi="Vazirmatn" w:cs="Vazirmatn"/>
+          <w:b w:val="0"/>
+          <w:color w:val="000000"/>
+          <w:sz w:val="22"/>
+          <w:rtl w:val="1"/>
+        </w:rPr>
+        <w:t>مدل جمع‌بند فقط بستهٔ دارای QA_PASSED را دریافت کند و محاسبهٔ امتیاز قابل‌بازاجرا باشد.</w:t>
       </w:r>
     </w:p>
     <w:p>
@@ -4055,7 +4257,7 @@
           <w:sz w:val="22"/>
           <w:rtl w:val="1"/>
         </w:rPr>
-        <w:t>مسیر ابزارهای سند نسبت به ریشهٔ پروژه محاسبه می‌شود. setup-local.ps1 محیط محلی را آماده و check-local.py تنظیمات را بررسی می‌کند. میزبان پیشنهادی 127.0.0.1 و پورت پیشنهادی 8765 است. این‌ها مقدمات‌اند و به معنی ساخته‌شدن سرور نیستند. مخزن GitHub تعیین شده است؛ آزمون دستگاه دوم هنوز باقی است.</w:t>
+        <w:t>مسیر ابزارهای سند نسبت به ریشهٔ پروژه محاسبه می‌شود. setup-local.ps1 محیط محلی را آماده و check-local.py تنظیمات را بررسی می‌کند. میزبان پیشنهادی 127.0.0.1 و پورت پیشنهادی 8765 است. این‌ها مقدمات‌اند و به معنی ساخته‌شدن سرور نیستند. آدرس مخزن و آزمون دستگاه دوم هنوز باقی‌اند.</w:t>
       </w:r>
     </w:p>
     <w:p>
@@ -4763,6 +4965,72 @@
                 <w:sz w:val="22"/>
                 <w:rtl w:val="1"/>
               </w:rPr>
+              <w:t>نظارت نهایی کیفیت</w:t>
+            </w:r>
+          </w:p>
+        </w:tc>
+        <w:tc>
+          <w:tcPr>
+            <w:tcW w:type="dxa" w:w="2250"/>
+          </w:tcPr>
+          <w:p>
+            <w:pPr>
+              <w:bidi/>
+              <w:jc w:val="right"/>
+            </w:pPr>
+            <w:r>
+              <w:rPr>
+                <w:rFonts w:ascii="Vazirmatn" w:hAnsi="Vazirmatn" w:cs="Vazirmatn"/>
+                <w:b w:val="0"/>
+                <w:color w:val="000000"/>
+                <w:sz w:val="22"/>
+                <w:rtl w:val="1"/>
+              </w:rPr>
+              <w:t>پس از ساخت ایجنت</w:t>
+            </w:r>
+          </w:p>
+        </w:tc>
+        <w:tc>
+          <w:tcPr>
+            <w:tcW w:type="dxa" w:w="4810"/>
+          </w:tcPr>
+          <w:p>
+            <w:pPr>
+              <w:bidi/>
+              <w:jc w:val="right"/>
+            </w:pPr>
+            <w:r>
+              <w:rPr>
+                <w:rFonts w:ascii="Vazirmatn" w:hAnsi="Vazirmatn" w:cs="Vazirmatn"/>
+                <w:b w:val="0"/>
+                <w:color w:val="000000"/>
+                <w:sz w:val="22"/>
+                <w:rtl w:val="1"/>
+              </w:rPr>
+              <w:t>پیش از جک، منبع/زمان/واحد، تناقض خروجی‌ها و فرمول امتیاز را کنترل می‌کند؛ اصلاح بی‌صدا ممنوع است.</w:t>
+            </w:r>
+          </w:p>
+        </w:tc>
+      </w:tr>
+      <w:tr>
+        <w:tc>
+          <w:tcPr>
+            <w:tcW w:type="dxa" w:w="2300"/>
+            <w:shd w:fill="F2F4F7"/>
+          </w:tcPr>
+          <w:p>
+            <w:pPr>
+              <w:bidi/>
+              <w:jc w:val="right"/>
+            </w:pPr>
+            <w:r>
+              <w:rPr>
+                <w:rFonts w:ascii="Vazirmatn" w:hAnsi="Vazirmatn" w:cs="Vazirmatn"/>
+                <w:b w:val="0"/>
+                <w:color w:val="000000"/>
+                <w:sz w:val="22"/>
+                <w:rtl w:val="1"/>
+              </w:rPr>
               <w:t>گزارش فارسی</w:t>
             </w:r>
           </w:p>
@@ -4770,6 +5038,7 @@
         <w:tc>
           <w:tcPr>
             <w:tcW w:type="dxa" w:w="2250"/>
+            <w:shd w:fill="F2F4F7"/>
           </w:tcPr>
           <w:p>
             <w:pPr>
@@ -4791,6 +5060,7 @@
         <w:tc>
           <w:tcPr>
             <w:tcW w:type="dxa" w:w="4810"/>
+            <w:shd w:fill="F2F4F7"/>
           </w:tcPr>
           <w:p>
             <w:pPr>
@@ -4893,7 +5163,59 @@
           <w:sz w:val="22"/>
           <w:rtl w:val="1"/>
         </w:rPr>
-        <w:t>گردش کار هدف: زمان‌بند محلی ← دریافت از مرورگر و منابع تأییدشده ← اعتبارسنجی ← ایجنت تابلو، تکنیکال، بنیادی، رویدادها و ریسک ← مدل جمع‌بند جک ← ذخیره و نمایش در index.html.</w:t>
+        <w:t>گردش کار هدف: زمان‌بند محلی ← دریافت از مرورگر و منابع تأییدشده ← اعتبارسنجی ← ایجنت تابلو، تکنیکال، بنیادی، رویدادها و ریسک ← ایجنت ناظر کیفیت و رفع خطا ← مدل جمع‌بند جک ← ذخیره و نمایش در index.html.</w:t>
+      </w:r>
+    </w:p>
+    <w:p>
+      <w:pPr>
+        <w:pStyle w:val="Heading2"/>
+        <w:keepNext/>
+        <w:bidi/>
+        <w:jc w:val="right"/>
+      </w:pPr>
+      <w:r>
+        <w:rPr>
+          <w:rFonts w:ascii="Vazirmatn" w:hAnsi="Vazirmatn" w:cs="Vazirmatn"/>
+          <w:b/>
+          <w:color w:val="2E74B5"/>
+          <w:sz w:val="26"/>
+          <w:rtl w:val="1"/>
+        </w:rPr>
+        <w:t>تقویم و زمان‌بندی بورس ایران</w:t>
+      </w:r>
+    </w:p>
+    <w:p>
+      <w:pPr>
+        <w:bidi/>
+        <w:spacing w:after="120" w:line="288" w:lineRule="auto"/>
+        <w:jc w:val="right"/>
+      </w:pPr>
+      <w:r>
+        <w:rPr>
+          <w:rFonts w:ascii="Vazirmatn" w:hAnsi="Vazirmatn" w:cs="Vazirmatn"/>
+          <w:b w:val="0"/>
+          <w:color w:val="000000"/>
+          <w:sz w:val="22"/>
+          <w:rtl w:val="1"/>
+        </w:rPr>
+        <w:t>برای بازار سهام بورس و فرابورس ایران، زمان‌بندی پایهٔ جک شنبه تا چهارشنبه، جلسهٔ اصلی معاملات از ۰۹:۰۰ تا ۱۲:۳۰ به منطقهٔ زمانی Asia/Tehran است. پیش‌گشایش حدود ۰۸:۴۵ و مرحلهٔ معاملات پایانی برای برخی نمادها ۱۲:۴۵ تا ۱۳:۰۰ است. این زمان‌ها باید در تنظیمات قابل‌اصلاح باشند؛ تعطیلات رسمی، توقف نماد، اطلاعیهٔ بازار و تغییر مقررات بر برنامهٔ پایه مقدم‌اند.</w:t>
+      </w:r>
+    </w:p>
+    <w:p>
+      <w:pPr>
+        <w:bidi/>
+        <w:spacing w:after="120" w:line="288" w:lineRule="auto"/>
+        <w:jc w:val="right"/>
+      </w:pPr>
+      <w:r>
+        <w:rPr>
+          <w:rFonts w:ascii="Vazirmatn" w:hAnsi="Vazirmatn" w:cs="Vazirmatn"/>
+          <w:b w:val="0"/>
+          <w:color w:val="000000"/>
+          <w:sz w:val="22"/>
+          <w:rtl w:val="1"/>
+        </w:rPr>
+        <w:t>زمان‌بند فقط در پنجره‌های تعیین‌شده تحلیل تازه و پایش بازار را اجرا می‌کند. بیرون از ساعت بازار، آخرین دادهٔ بازار زنده تلقی نمی‌شود؛ جک فقط گزارش‌های قبلی را نمایش می‌دهد یا برای اجرای بعدی آماده می‌شود. در روز تعطیل یا وقتی تقویم/وضعیت بازار نامشخص است، اجرای تحلیلی با MARKET_CLOSED یا DATA_BLOCKED ثبت می‌شود.</w:t>
       </w:r>
     </w:p>
     <w:p>
@@ -5053,7 +5375,7 @@
     </w:p>
     <w:p>
       <w:pPr>
-        <w:pStyle w:val="Heading2"/>
+        <w:pStyle w:val="Heading1"/>
         <w:keepNext/>
         <w:bidi/>
         <w:jc w:val="right"/>
@@ -5063,10 +5385,10 @@
           <w:rFonts w:ascii="Vazirmatn" w:hAnsi="Vazirmatn" w:cs="Vazirmatn"/>
           <w:b/>
           <w:color w:val="2E74B5"/>
-          <w:sz w:val="26"/>
+          <w:sz w:val="32"/>
           <w:rtl w:val="1"/>
         </w:rPr>
-        <w:t>تقویم و زمان‌بندی بورس ایران</w:t>
+        <w:t>۱۸. ایجنت ناظر کیفیت و رفع خطا</w:t>
       </w:r>
     </w:p>
     <w:p>
@@ -5083,7 +5405,7 @@
           <w:sz w:val="22"/>
           <w:rtl w:val="1"/>
         </w:rPr>
-        <w:t>برای بازار سهام بورس و فرابورس ایران، زمان‌بندی پایهٔ جک شنبه تا چهارشنبه، جلسهٔ اصلی معاملات از ۰۹:۰۰ تا ۱۲:۳۰ به منطقهٔ زمانی Asia/Tehran است. پیش‌گشایش حدود ۰۸:۴۵ و مرحلهٔ معاملات پایانی برای برخی نمادها ۱۲:۴۵ تا ۱۳:۰۰ است. این زمان‌ها باید در تنظیمات قابل‌اصلاح باشند؛ تعطیلات رسمی، توقف نماد، اطلاعیهٔ بازار و تغییر مقررات بر برنامهٔ پایه مقدم‌اند.</w:t>
+        <w:t>ایجنت ناظر کیفیت، آخرین دروازهٔ فنی پیش از جک است. این نقش رأی تحلیلی یا پیشنهاد خرید/فروش صادر نمی‌کند؛ دادهٔ خام، خروجی ایجنت‌ها، نسخهٔ قواعد امتیاز و نتیجهٔ ریسک را کنترل می‌کند تا خطای خواندن داده یا امتیازدهی ناسازگار وارد گزارش نشود.</w:t>
       </w:r>
     </w:p>
     <w:p>
@@ -5100,7 +5422,24 @@
           <w:sz w:val="22"/>
           <w:rtl w:val="1"/>
         </w:rPr>
-        <w:t>زمان‌بند فقط در پنجره‌های تعیین‌شده تحلیل تازه و پایش بازار را اجرا می‌کند. بیرون از ساعت بازار، آخرین دادهٔ بازار زنده تلقی نمی‌شود؛ جک فقط گزارش‌های قبلی را نمایش می‌دهد یا برای اجرای بعدی آماده می‌شود. در روز تعطیل یا وقتی تقویم/وضعیت بازار نامشخص است، اجرای تحلیلی با MARKET_CLOSED یا DATA_BLOCKED ثبت می‌شود.</w:t>
+        <w:t>کنترل‌ها شامل بازاجرای قطعی فرمول امتیاز و وزن‌ها، بررسی آستانه‌ها و گردکردن عددی، تطبیق واحد ریال/تومان و نوع قیمت، کنترل تازگی و منبع، و تشخیص تعارض بین ایجنت‌ها است. ناظر هرگز داده یا امتیاز را بی‌صدا تغییر نمی‌دهد؛ خطا با شناسه، عامل مسئول و مسیر بازاجرا ثبت می‌شود.</w:t>
+      </w:r>
+    </w:p>
+    <w:p>
+      <w:pPr>
+        <w:bidi/>
+        <w:spacing w:after="120" w:line="288" w:lineRule="auto"/>
+        <w:jc w:val="right"/>
+      </w:pPr>
+      <w:r>
+        <w:rPr>
+          <w:rFonts w:ascii="Vazirmatn" w:hAnsi="Vazirmatn" w:cs="Vazirmatn"/>
+          <w:b w:val="0"/>
+          <w:color w:val="000000"/>
+          <w:sz w:val="22"/>
+          <w:rtl w:val="1"/>
+        </w:rPr>
+        <w:t>فقط بستهٔ QA_PASSED به جک تحویل می‌شود. QA_RETRY فقط مرحلهٔ معیوب را برای اصلاح بازمی‌گرداند. در نقص غیرقابل‌رفع یا تکراری، QA_BLOCKED ثبت می‌شود و گزارش جک باید عدم اعلام نظر یا DATA_BLOCKED باشد.</w:t>
       </w:r>
     </w:p>
     <w:sectPr>

</xml_diff>

<commit_message>
Add indicator conflict quality gate
</commit_message>
<xml_diff>
--- a/مستند-پروژه-جک.docx
+++ b/مستند-پروژه-جک.docx
@@ -5422,7 +5422,24 @@
           <w:sz w:val="22"/>
           <w:rtl w:val="1"/>
         </w:rPr>
-        <w:t>کنترل‌ها شامل بازاجرای قطعی فرمول امتیاز و وزن‌ها، بررسی آستانه‌ها و گردکردن عددی، تطبیق واحد ریال/تومان و نوع قیمت، کنترل تازگی و منبع، و تشخیص تعارض بین ایجنت‌ها است. ناظر هرگز داده یا امتیاز را بی‌صدا تغییر نمی‌دهد؛ خطا با شناسه، عامل مسئول و مسیر بازاجرا ثبت می‌شود.</w:t>
+        <w:t>کنترل‌ها شامل بازاجرای قطعی فرمول امتیاز و وزن‌ها، بررسی آستانه‌ها و گردکردن عددی، تطبیق واحد ریال/تومان و نوع قیمت، کنترل تازگی و منبع، و تشخیص تعارض بین ایجنت‌ها است. ناظر همچنین اندیکاتورهای هم‌خانواده و هم‌پوشان را بر اساس نوع سیگنال، دادهٔ ورودی، تایم‌فریم و پارامترها گروه‌بندی می‌کند تا یک شاهد چندبار در امتیاز تقویت نشود.</w:t>
+      </w:r>
+    </w:p>
+    <w:p>
+      <w:pPr>
+        <w:bidi/>
+        <w:spacing w:after="120" w:line="288" w:lineRule="auto"/>
+        <w:jc w:val="right"/>
+      </w:pPr>
+      <w:r>
+        <w:rPr>
+          <w:rFonts w:ascii="Vazirmatn" w:hAnsi="Vazirmatn" w:cs="Vazirmatn"/>
+          <w:b w:val="0"/>
+          <w:color w:val="000000"/>
+          <w:sz w:val="22"/>
+          <w:rtl w:val="1"/>
+        </w:rPr>
+        <w:t>تعارض مؤثر اندیکاتورها با کد INDICATOR_CONFLICT، نام و پارامتر اندیکاتورها، تایم‌فریم، جهت هر سیگنال و اثر عددی آن بر امتیاز ثبت می‌شود. اختلاف طبیعی میان تایم‌فریم‌ها باید جداگانه برچسب بخورد. ناظر هرگز داده یا امتیاز را بی‌صدا تغییر نمی‌دهد؛ حذف یا ترجیح‌دادن اندیکاتور فقط با قاعدهٔ نسخه‌بندی‌شدهٔ از پیش‌تأییدشده مجاز است.</w:t>
       </w:r>
     </w:p>
     <w:p>

</xml_diff>

<commit_message>
Build local Jack demo dashboard
</commit_message>
<xml_diff>
--- a/مستند-پروژه-جک.docx
+++ b/مستند-پروژه-جک.docx
@@ -1296,7 +1296,7 @@
           <w:sz w:val="22"/>
           <w:rtl w:val="1"/>
         </w:rPr>
-        <w:t>ساختار پیشنهادی فایل‌ها زیر F:\Automasion: پوشهٔ backend برای پایتون، frontend/index.html برای رابط، data برای داده‌ها، reports برای گزارش‌ها و skills برای اسکیل‌ها. این ساختار در مرحلهٔ مستندسازی است و هنوز پیاده‌سازی نشده است.</w:t>
+        <w:t>ساختار فعلی فایل‌ها زیر F:\Automasion شامل backend برای پایتون و سرور localhost، frontend/index.html برای رابط، tests برای آزمون خودکار، data و reports برای داده و گزارش محلیِ آینده و skills برای اسکیل‌ها است. نسخهٔ اولیه فقط دادهٔ نمونهٔ داخلی را تحلیل می‌کند و دادهٔ واقعی پرتفوی نگه نمی‌دارد.</w:t>
       </w:r>
     </w:p>
     <w:tbl>
@@ -5459,6 +5459,58 @@
         <w:t>فقط بستهٔ QA_PASSED به جک تحویل می‌شود. QA_RETRY فقط مرحلهٔ معیوب را برای اصلاح بازمی‌گرداند. در نقص غیرقابل‌رفع یا تکراری، QA_BLOCKED ثبت می‌شود و گزارش جک باید عدم اعلام نظر یا DATA_BLOCKED باشد.</w:t>
       </w:r>
     </w:p>
+    <w:p>
+      <w:pPr>
+        <w:pStyle w:val="Heading1"/>
+        <w:keepNext/>
+        <w:bidi/>
+        <w:jc w:val="right"/>
+      </w:pPr>
+      <w:r>
+        <w:rPr>
+          <w:rFonts w:ascii="Vazirmatn" w:hAnsi="Vazirmatn" w:cs="Vazirmatn"/>
+          <w:b/>
+          <w:color w:val="2E74B5"/>
+          <w:sz w:val="32"/>
+          <w:rtl w:val="1"/>
+        </w:rPr>
+        <w:t>۱۹. وضعیت پیاده‌سازی نسخهٔ اولیه</w:t>
+      </w:r>
+    </w:p>
+    <w:p>
+      <w:pPr>
+        <w:bidi/>
+        <w:spacing w:after="120" w:line="288" w:lineRule="auto"/>
+        <w:jc w:val="right"/>
+      </w:pPr>
+      <w:r>
+        <w:rPr>
+          <w:rFonts w:ascii="Vazirmatn" w:hAnsi="Vazirmatn" w:cs="Vazirmatn"/>
+          <w:b w:val="0"/>
+          <w:color w:val="000000"/>
+          <w:sz w:val="22"/>
+          <w:rtl w:val="1"/>
+        </w:rPr>
+        <w:t>نسخهٔ اولیهٔ قابل‌اجرا شامل سرور استاندارد پایتون فقط روی 127.0.0.1:8765، داشبورد فارسی HTML و گزارش نمونهٔ غیرشخصی است. سرور وضعیت سلامت و گزارش نمونه را به رابط محلی می‌دهد. این نسخه هیچ اتصال کارگزاری، نگهداری نشست، سفارش‌گذاری یا اقدام مالی ندارد.</w:t>
+      </w:r>
+    </w:p>
+    <w:p>
+      <w:pPr>
+        <w:bidi/>
+        <w:spacing w:after="120" w:line="288" w:lineRule="auto"/>
+        <w:jc w:val="right"/>
+      </w:pPr>
+      <w:r>
+        <w:rPr>
+          <w:rFonts w:ascii="Vazirmatn" w:hAnsi="Vazirmatn" w:cs="Vazirmatn"/>
+          <w:b w:val="0"/>
+          <w:color w:val="000000"/>
+          <w:sz w:val="22"/>
+          <w:rtl w:val="1"/>
+        </w:rPr>
+        <w:t>ناظر کیفیت نمونه در هستهٔ پایتون هم‌پوشانی اندیکاتورهای هم‌خانواده را سقف‌دهی می‌کند و تعارض مؤثر را با INDICATOR_CONFLICT مسدود می‌سازد. دریافت واقعی پرتفوی پس از ورود دستی کاربر، دریافت دادهٔ بازار و ایجنت‌های تخصصی کامل، مراحل بعدی پیاده‌سازی هستند.</w:t>
+      </w:r>
+    </w:p>
     <w:sectPr>
       <w:footerReference w:type="default" r:id="rId9"/>
       <w:pgSz w:w="12240" w:h="15840"/>

</xml_diff>

<commit_message>
Add dashboard symbol input
</commit_message>
<xml_diff>
--- a/مستند-پروژه-جک.docx
+++ b/مستند-پروژه-جک.docx
@@ -5508,6 +5508,23 @@
           <w:sz w:val="22"/>
           <w:rtl w:val="1"/>
         </w:rPr>
+        <w:t>داشبورد فیلد نماد دارد و نام نماد را در مسیر محلی برنامه اعتبارسنجی می‌کند. انتخاب نماد تا پیش از اتصال منبع دادهٔ بازار و خواندن مرورگر، DATA_BLOCKED با کد MARKET_SOURCE_NOT_CONNECTED تولید می‌کند؛ این توقف عمدی برای جلوگیری از تحلیل بر پایهٔ دادهٔ حدسی است.</w:t>
+      </w:r>
+    </w:p>
+    <w:p>
+      <w:pPr>
+        <w:bidi/>
+        <w:spacing w:after="120" w:line="288" w:lineRule="auto"/>
+        <w:jc w:val="right"/>
+      </w:pPr>
+      <w:r>
+        <w:rPr>
+          <w:rFonts w:ascii="Vazirmatn" w:hAnsi="Vazirmatn" w:cs="Vazirmatn"/>
+          <w:b w:val="0"/>
+          <w:color w:val="000000"/>
+          <w:sz w:val="22"/>
+          <w:rtl w:val="1"/>
+        </w:rPr>
         <w:t>ناظر کیفیت نمونه در هستهٔ پایتون هم‌پوشانی اندیکاتورهای هم‌خانواده را سقف‌دهی می‌کند و تعارض مؤثر را با INDICATOR_CONFLICT مسدود می‌سازد. دریافت واقعی پرتفوی پس از ورود دستی کاربر، دریافت دادهٔ بازار و ایجنت‌های تخصصی کامل، مراحل بعدی پیاده‌سازی هستند.</w:t>
       </w:r>
     </w:p>

</xml_diff>

<commit_message>
Add validated local market snapshot analysis
</commit_message>
<xml_diff>
--- a/مستند-پروژه-جک.docx
+++ b/مستند-پروژه-جک.docx
@@ -5525,6 +5525,23 @@
           <w:sz w:val="22"/>
           <w:rtl w:val="1"/>
         </w:rPr>
+        <w:t>برای آزمون هستهٔ داده، بستهٔ OHLCV همراه با منبع، زمان، واحد و نوع قیمت وارد مسیر محلی می‌شود. میزبان‌های مجاز در market.approved_source_hosts نگهداری می‌شوند و در صورت نبود این بخش در تنظیمات خصوصی دستگاه، فهرست پیش‌فرض config.example.toml اعمال می‌شود. اتصال خودکار مرورگر و دریافت واقعی داده، مرحلهٔ بعدی است.</w:t>
+      </w:r>
+    </w:p>
+    <w:p>
+      <w:pPr>
+        <w:bidi/>
+        <w:spacing w:after="120" w:line="288" w:lineRule="auto"/>
+        <w:jc w:val="right"/>
+      </w:pPr>
+      <w:r>
+        <w:rPr>
+          <w:rFonts w:ascii="Vazirmatn" w:hAnsi="Vazirmatn" w:cs="Vazirmatn"/>
+          <w:b w:val="0"/>
+          <w:color w:val="000000"/>
+          <w:sz w:val="22"/>
+          <w:rtl w:val="1"/>
+        </w:rPr>
         <w:t>ناظر کیفیت نمونه در هستهٔ پایتون هم‌پوشانی اندیکاتورهای هم‌خانواده را سقف‌دهی می‌کند و تعارض مؤثر را با INDICATOR_CONFLICT مسدود می‌سازد. دریافت واقعی پرتفوی پس از ورود دستی کاربر، دریافت دادهٔ بازار و ایجنت‌های تخصصی کامل، مراحل بعدی پیاده‌سازی هستند.</w:t>
       </w:r>
     </w:p>

</xml_diff>

<commit_message>
Add traceable market capture agent
</commit_message>
<xml_diff>
--- a/مستند-پروژه-جک.docx
+++ b/مستند-پروژه-جک.docx
@@ -5545,6 +5545,58 @@
         <w:t>ناظر کیفیت نمونه در هستهٔ پایتون هم‌پوشانی اندیکاتورهای هم‌خانواده را سقف‌دهی می‌کند و تعارض مؤثر را با INDICATOR_CONFLICT مسدود می‌سازد. دریافت واقعی پرتفوی پس از ورود دستی کاربر، دریافت دادهٔ بازار و ایجنت‌های تخصصی کامل، مراحل بعدی پیاده‌سازی هستند.</w:t>
       </w:r>
     </w:p>
+    <w:p>
+      <w:pPr>
+        <w:pStyle w:val="Heading1"/>
+        <w:keepNext/>
+        <w:bidi/>
+        <w:jc w:val="right"/>
+      </w:pPr>
+      <w:r>
+        <w:rPr>
+          <w:rFonts w:ascii="Vazirmatn" w:hAnsi="Vazirmatn" w:cs="Vazirmatn"/>
+          <w:b/>
+          <w:color w:val="2E74B5"/>
+          <w:sz w:val="32"/>
+          <w:rtl w:val="1"/>
+        </w:rPr>
+        <w:t>۲۰. اولین ایجنت اجرایی</w:t>
+      </w:r>
+    </w:p>
+    <w:p>
+      <w:pPr>
+        <w:bidi/>
+        <w:spacing w:after="120" w:line="288" w:lineRule="auto"/>
+        <w:jc w:val="right"/>
+      </w:pPr>
+      <w:r>
+        <w:rPr>
+          <w:rFonts w:ascii="Vazirmatn" w:hAnsi="Vazirmatn" w:cs="Vazirmatn"/>
+          <w:b w:val="0"/>
+          <w:color w:val="000000"/>
+          <w:sz w:val="22"/>
+          <w:rtl w:val="1"/>
+        </w:rPr>
+        <w:t>ایجنت market-capture-agent در backend/agents/market_capture.py ساخته شده است. این ایجنت تنها مرز ورود دادهٔ بازار به هستهٔ تحلیل است: نماد انتخاب‌شده، میزبان منبع، زمان، منطقهٔ زمانی، واحد، نوع قیمت و سازگاری OHLCV را کنترل می‌کند و برای هر اجرا run_id می‌سازد.</w:t>
+      </w:r>
+    </w:p>
+    <w:p>
+      <w:pPr>
+        <w:bidi/>
+        <w:spacing w:after="120" w:line="288" w:lineRule="auto"/>
+        <w:jc w:val="right"/>
+      </w:pPr>
+      <w:r>
+        <w:rPr>
+          <w:rFonts w:ascii="Vazirmatn" w:hAnsi="Vazirmatn" w:cs="Vazirmatn"/>
+          <w:b w:val="0"/>
+          <w:color w:val="000000"/>
+          <w:sz w:val="22"/>
+          <w:rtl w:val="1"/>
+        </w:rPr>
+        <w:t>بستهٔ معتبر با وضعیت CAPTURED به هستهٔ تحلیل می‌رسد و بستهٔ نامعتبر با DATA_BLOCKED، کد خطا و نیازمندی بازاجرا به داشبورد برمی‌گردد. ایجنت هیچ ورود کارگزاری، نگهداری نشست یا اقدام مالی ندارد. اتصال خودکار مرورگر در مرحلهٔ بعد به قرارداد همین ایجنت اضافه می‌شود.</w:t>
+      </w:r>
+    </w:p>
     <w:sectPr>
       <w:footerReference w:type="default" r:id="rId9"/>
       <w:pgSz w:w="12240" w:h="15840"/>

</xml_diff>

<commit_message>
Add technical analysis agent
</commit_message>
<xml_diff>
--- a/مستند-پروژه-جک.docx
+++ b/مستند-پروژه-جک.docx
@@ -5597,6 +5597,75 @@
         <w:t>بستهٔ معتبر با وضعیت CAPTURED به هستهٔ تحلیل می‌رسد و بستهٔ نامعتبر با DATA_BLOCKED، کد خطا و نیازمندی بازاجرا به داشبورد برمی‌گردد. ایجنت هیچ ورود کارگزاری، نگهداری نشست یا اقدام مالی ندارد. اتصال خودکار مرورگر در مرحلهٔ بعد به قرارداد همین ایجنت اضافه می‌شود.</w:t>
       </w:r>
     </w:p>
+    <w:p>
+      <w:pPr>
+        <w:pStyle w:val="Heading1"/>
+        <w:keepNext/>
+        <w:bidi/>
+        <w:jc w:val="right"/>
+      </w:pPr>
+      <w:r>
+        <w:rPr>
+          <w:rFonts w:ascii="Vazirmatn" w:hAnsi="Vazirmatn" w:cs="Vazirmatn"/>
+          <w:b/>
+          <w:color w:val="2E74B5"/>
+          <w:sz w:val="32"/>
+          <w:rtl w:val="1"/>
+        </w:rPr>
+        <w:t>۲۱. ایجنت تکنیکال</w:t>
+      </w:r>
+    </w:p>
+    <w:p>
+      <w:pPr>
+        <w:bidi/>
+        <w:spacing w:after="120" w:line="288" w:lineRule="auto"/>
+        <w:jc w:val="right"/>
+      </w:pPr>
+      <w:r>
+        <w:rPr>
+          <w:rFonts w:ascii="Vazirmatn" w:hAnsi="Vazirmatn" w:cs="Vazirmatn"/>
+          <w:b w:val="0"/>
+          <w:color w:val="000000"/>
+          <w:sz w:val="22"/>
+          <w:rtl w:val="1"/>
+        </w:rPr>
+        <w:t>ایجنت تکنیکال در backend/agents/technical_analysis.py پس از ایجنت دریافت اجرا می‌شود؛ شناسهٔ فنی آن technical-analysis-agent است. تنها ورودی مجاز آن بسته‌ای است که data_status=VALID و کنترل کیفیت آن QA_PASSED باشد. در هر وضعیت دیگر، ایجنت SKIPPED با دلیل توقف ثبت می‌کند.</w:t>
+      </w:r>
+    </w:p>
+    <w:p>
+      <w:pPr>
+        <w:bidi/>
+        <w:spacing w:after="120" w:line="288" w:lineRule="auto"/>
+        <w:jc w:val="right"/>
+      </w:pPr>
+      <w:r>
+        <w:rPr>
+          <w:rFonts w:ascii="Vazirmatn" w:hAnsi="Vazirmatn" w:cs="Vazirmatn"/>
+          <w:b w:val="0"/>
+          <w:color w:val="000000"/>
+          <w:sz w:val="22"/>
+          <w:rtl w:val="1"/>
+        </w:rPr>
+        <w:t>در نسخهٔ اولیه، ایجنت شواهد روند SMA و مومنتوم RSI را همراه با نام، خانواده، تایم‌فریم، جهت و پارامترها جمع‌بندی می‌کند. خروجی یکی از ALIGNED_BULLISH، ALIGNED_BEARISH، MIXED یا NEUTRAL_OR_INCOMPLETE است. این کدها فقط توصیف وضعیت فنی‌اند، نه پیشنهاد خرید یا فروش.</w:t>
+      </w:r>
+    </w:p>
+    <w:p>
+      <w:pPr>
+        <w:bidi/>
+        <w:spacing w:after="120" w:line="288" w:lineRule="auto"/>
+        <w:jc w:val="right"/>
+      </w:pPr>
+      <w:r>
+        <w:rPr>
+          <w:rFonts w:ascii="Vazirmatn" w:hAnsi="Vazirmatn" w:cs="Vazirmatn"/>
+          <w:b w:val="0"/>
+          <w:color w:val="000000"/>
+          <w:sz w:val="22"/>
+          <w:rtl w:val="1"/>
+        </w:rPr>
+        <w:t>ایجنت برای هر اجرا run_id می‌سازد، دادهٔ خام یا تصمیم جک را تغییر نمی‌دهد و به کارگزاری، نشست مرورگر یا اقدام مالی دسترسی ندارد. قرارداد کامل آن در agents/technical-analysis.md نگهداری می‌شود.</w:t>
+      </w:r>
+    </w:p>
     <w:sectPr>
       <w:footerReference w:type="default" r:id="rId9"/>
       <w:pgSz w:w="12240" w:h="15840"/>

</xml_diff>

<commit_message>
Add chart control agent
</commit_message>
<xml_diff>
--- a/مستند-پروژه-جک.docx
+++ b/مستند-پروژه-جک.docx
@@ -5666,6 +5666,75 @@
         <w:t>ایجنت برای هر اجرا run_id می‌سازد، دادهٔ خام یا تصمیم جک را تغییر نمی‌دهد و به کارگزاری، نشست مرورگر یا اقدام مالی دسترسی ندارد. قرارداد کامل آن در agents/technical-analysis.md نگهداری می‌شود.</w:t>
       </w:r>
     </w:p>
+    <w:p>
+      <w:pPr>
+        <w:pStyle w:val="Heading1"/>
+        <w:keepNext/>
+        <w:bidi/>
+        <w:jc w:val="right"/>
+      </w:pPr>
+      <w:r>
+        <w:rPr>
+          <w:rFonts w:ascii="Vazirmatn" w:hAnsi="Vazirmatn" w:cs="Vazirmatn"/>
+          <w:b/>
+          <w:color w:val="2E74B5"/>
+          <w:sz w:val="32"/>
+          <w:rtl w:val="1"/>
+        </w:rPr>
+        <w:t>۲۲. ایجنت کنترل نمودار و اندیکاتور</w:t>
+      </w:r>
+    </w:p>
+    <w:p>
+      <w:pPr>
+        <w:bidi/>
+        <w:spacing w:after="120" w:line="288" w:lineRule="auto"/>
+        <w:jc w:val="right"/>
+      </w:pPr>
+      <w:r>
+        <w:rPr>
+          <w:rFonts w:ascii="Vazirmatn" w:hAnsi="Vazirmatn" w:cs="Vazirmatn"/>
+          <w:b w:val="0"/>
+          <w:color w:val="000000"/>
+          <w:sz w:val="22"/>
+          <w:rtl w:val="1"/>
+        </w:rPr>
+        <w:t>ایجنت کنترل نمودار در backend/agents/chart_control.py پس از ایجنت تکنیکال اجرا می‌شود؛ شناسهٔ فنی آن chart-control-agent است. نسخهٔ اولیه هنوز مرورگر را باز یا کنترل نمی‌کند؛ یک مشاهدهٔ ثبت‌شدهٔ نمودار را به‌عنوان ورودی فقط‌خواندنی دریافت می‌کند.</w:t>
+      </w:r>
+    </w:p>
+    <w:p>
+      <w:pPr>
+        <w:bidi/>
+        <w:spacing w:after="120" w:line="288" w:lineRule="auto"/>
+        <w:jc w:val="right"/>
+      </w:pPr>
+      <w:r>
+        <w:rPr>
+          <w:rFonts w:ascii="Vazirmatn" w:hAnsi="Vazirmatn" w:cs="Vazirmatn"/>
+          <w:b w:val="0"/>
+          <w:color w:val="000000"/>
+          <w:sz w:val="22"/>
+          <w:rtl w:val="1"/>
+        </w:rPr>
+        <w:t>این ایجنت تطابق نماد و تایم‌فریم با دادهٔ OHLCV، HTTPS و مصوب‌بودن میزبان منبع، زمان Asia/Tehran و مجازبودن اندیکاتورها را کنترل می‌کند. جهت اندیکاتورهای دارای نام مشترک با محاسبهٔ مستقل OHLCV نیز مقایسه می‌شود.</w:t>
+      </w:r>
+    </w:p>
+    <w:p>
+      <w:pPr>
+        <w:bidi/>
+        <w:spacing w:after="120" w:line="288" w:lineRule="auto"/>
+        <w:jc w:val="right"/>
+      </w:pPr>
+      <w:r>
+        <w:rPr>
+          <w:rFonts w:ascii="Vazirmatn" w:hAnsi="Vazirmatn" w:cs="Vazirmatn"/>
+          <w:b w:val="0"/>
+          <w:color w:val="000000"/>
+          <w:sz w:val="22"/>
+          <w:rtl w:val="1"/>
+        </w:rPr>
+        <w:t>نبود مشاهدهٔ نمودار صرفاً SKIPPED است. مشاهدهٔ نامعتبر CHART_BLOCKED و اختلاف جهت CHART_CONFLICT است؛ هر دو خطا به‌صورت قابل‌ردیابی به QA_BLOCKED و DATA_BLOCKED تبدیل می‌شوند. این ایجنت هیچ سفارش یا اقدام مالی انجام نمی‌دهد. قرارداد کامل در agents/chart-control.md است.</w:t>
+      </w:r>
+    </w:p>
     <w:sectPr>
       <w:footerReference w:type="default" r:id="rId9"/>
       <w:pgSz w:w="12240" w:h="15840"/>

</xml_diff>

<commit_message>
Add browser portfolio agent
</commit_message>
<xml_diff>
--- a/مستند-پروژه-جک.docx
+++ b/مستند-پروژه-جک.docx
@@ -5525,7 +5525,7 @@
           <w:sz w:val="22"/>
           <w:rtl w:val="1"/>
         </w:rPr>
-        <w:t>برای آزمون هستهٔ داده، بستهٔ OHLCV همراه با منبع، زمان، واحد و نوع قیمت وارد مسیر محلی می‌شود. میزبان‌های مجاز در market.approved_source_hosts نگهداری می‌شوند و در صورت نبود این بخش در تنظیمات خصوصی دستگاه، فهرست پیش‌فرض config.example.toml اعمال می‌شود. اتصال خودکار مرورگر و دریافت واقعی داده، مرحلهٔ بعدی است.</w:t>
+        <w:t>برای آزمون هستهٔ داده، بستهٔ OHLCV همراه با منبع، زمان، واحد و نوع قیمت وارد مسیر محلی می‌شود. میزبان‌های دادهٔ بازار در market.approved_hosts نگهداری می‌شوند. میزبان کارگزاری فقط در brokerage.approved_hosts تنظیمات خصوصی دستگاه ثبت می‌شود و فهرست پیش‌فرض Git عمداً خالی است. پل عملی مرورگر و دریافت واقعی داده، مرحلهٔ بعدی است.</w:t>
       </w:r>
     </w:p>
     <w:p>
@@ -5733,6 +5733,75 @@
           <w:rtl w:val="1"/>
         </w:rPr>
         <w:t>نبود مشاهدهٔ نمودار صرفاً SKIPPED است. مشاهدهٔ نامعتبر CHART_BLOCKED و اختلاف جهت CHART_CONFLICT است؛ هر دو خطا به‌صورت قابل‌ردیابی به QA_BLOCKED و DATA_BLOCKED تبدیل می‌شوند. این ایجنت هیچ سفارش یا اقدام مالی انجام نمی‌دهد. قرارداد کامل در agents/chart-control.md است.</w:t>
+      </w:r>
+    </w:p>
+    <w:p>
+      <w:pPr>
+        <w:pStyle w:val="Heading1"/>
+        <w:keepNext/>
+        <w:bidi/>
+        <w:jc w:val="right"/>
+      </w:pPr>
+      <w:r>
+        <w:rPr>
+          <w:rFonts w:ascii="Vazirmatn" w:hAnsi="Vazirmatn" w:cs="Vazirmatn"/>
+          <w:b/>
+          <w:color w:val="2E74B5"/>
+          <w:sz w:val="32"/>
+          <w:rtl w:val="1"/>
+        </w:rPr>
+        <w:t>۲۳. ایجنت مرورگر و پرتفوی</w:t>
+      </w:r>
+    </w:p>
+    <w:p>
+      <w:pPr>
+        <w:bidi/>
+        <w:spacing w:after="120" w:line="288" w:lineRule="auto"/>
+        <w:jc w:val="right"/>
+      </w:pPr>
+      <w:r>
+        <w:rPr>
+          <w:rFonts w:ascii="Vazirmatn" w:hAnsi="Vazirmatn" w:cs="Vazirmatn"/>
+          <w:b w:val="0"/>
+          <w:color w:val="000000"/>
+          <w:sz w:val="22"/>
+          <w:rtl w:val="1"/>
+        </w:rPr>
+        <w:t>ایجنت مرورگر و پرتفوی در backend/agents/browser_portfolio.py ساخته شده است؛ شناسهٔ فنی آن browser-portfolio-agent است. این نسخه دادهٔ قابل‌مشاهدهٔ پرتفوی را فقط در حافظهٔ همان درخواست اعتبارسنجی می‌کند و هیچ رمز، OTP، CAPTCHA، کوکی یا نشست را دریافت یا ذخیره نمی‌کند.</w:t>
+      </w:r>
+    </w:p>
+    <w:p>
+      <w:pPr>
+        <w:bidi/>
+        <w:spacing w:after="120" w:line="288" w:lineRule="auto"/>
+        <w:jc w:val="right"/>
+      </w:pPr>
+      <w:r>
+        <w:rPr>
+          <w:rFonts w:ascii="Vazirmatn" w:hAnsi="Vazirmatn" w:cs="Vazirmatn"/>
+          <w:b w:val="0"/>
+          <w:color w:val="000000"/>
+          <w:sz w:val="22"/>
+          <w:rtl w:val="1"/>
+        </w:rPr>
+        <w:t>مشاهدهٔ پرتفوی باید منبع HTTPS مصوب، زمان، منطقهٔ زمانی Asia/Tehran، واحد IRR یا IRT و ردیف‌های دارایی دارای نماد، تعداد، میانگین قیمت، قیمت آخر و ارزش بازار داشته باشد. میزبان کارگزاری فقط در brokerage.approved_hosts فایل خصوصی config.local.toml تأیید می‌شود و در مخزن Git ثبت نمی‌شود.</w:t>
+      </w:r>
+    </w:p>
+    <w:p>
+      <w:pPr>
+        <w:bidi/>
+        <w:spacing w:after="120" w:line="288" w:lineRule="auto"/>
+        <w:jc w:val="right"/>
+      </w:pPr>
+      <w:r>
+        <w:rPr>
+          <w:rFonts w:ascii="Vazirmatn" w:hAnsi="Vazirmatn" w:cs="Vazirmatn"/>
+          <w:b w:val="0"/>
+          <w:color w:val="000000"/>
+          <w:sz w:val="22"/>
+          <w:rtl w:val="1"/>
+        </w:rPr>
+        <w:t>تا پیش از اتصال پل عملی مرورگر، وضعیت WAITING_FOR_BROWSER_SOURCE است. مشاهدهٔ معتبر PORTFOLIO_CAPTURED و مشاهدهٔ ناقص، حساس یا از منبع غیرمجاز PORTFOLIO_BLOCKED است. اتصال Chrome، ورود دستی کاربر و استخراج خودکار صفحه در مرحلهٔ بعد انجام می‌شود؛ ایجنت هیچ سفارش یا اقدام مالی ندارد.</w:t>
       </w:r>
     </w:p>
     <w:sectPr>

</xml_diff>

<commit_message>
Add market board agent
</commit_message>
<xml_diff>
--- a/مستند-پروژه-جک.docx
+++ b/مستند-پروژه-جک.docx
@@ -5804,6 +5804,75 @@
         <w:t>تا پیش از اتصال پل عملی مرورگر، وضعیت WAITING_FOR_BROWSER_SOURCE است. مشاهدهٔ معتبر PORTFOLIO_CAPTURED و مشاهدهٔ ناقص، حساس یا از منبع غیرمجاز PORTFOLIO_BLOCKED است. اتصال Chrome، ورود دستی کاربر و استخراج خودکار صفحه در مرحلهٔ بعد انجام می‌شود؛ ایجنت هیچ سفارش یا اقدام مالی ندارد.</w:t>
       </w:r>
     </w:p>
+    <w:p>
+      <w:pPr>
+        <w:pStyle w:val="Heading1"/>
+        <w:keepNext/>
+        <w:bidi/>
+        <w:jc w:val="right"/>
+      </w:pPr>
+      <w:r>
+        <w:rPr>
+          <w:rFonts w:ascii="Vazirmatn" w:hAnsi="Vazirmatn" w:cs="Vazirmatn"/>
+          <w:b/>
+          <w:color w:val="2E74B5"/>
+          <w:sz w:val="32"/>
+          <w:rtl w:val="1"/>
+        </w:rPr>
+        <w:t>۲۴. ایجنت تابلو</w:t>
+      </w:r>
+    </w:p>
+    <w:p>
+      <w:pPr>
+        <w:bidi/>
+        <w:spacing w:after="120" w:line="288" w:lineRule="auto"/>
+        <w:jc w:val="right"/>
+      </w:pPr>
+      <w:r>
+        <w:rPr>
+          <w:rFonts w:ascii="Vazirmatn" w:hAnsi="Vazirmatn" w:cs="Vazirmatn"/>
+          <w:b w:val="0"/>
+          <w:color w:val="000000"/>
+          <w:sz w:val="22"/>
+          <w:rtl w:val="1"/>
+        </w:rPr>
+        <w:t>ایجنت تابلو در backend/agents/market_board.py پس از ایجنت کنترل نمودار اجرا می‌شود؛ شناسهٔ فنی آن market-board-agent است. این نسخه فقط مشاهدهٔ ساخت‌یافته و فقط‌خواندنی حجم، صف و جریان حقیقی/حقوقی را کنترل می‌کند و نه وارد کارگزاری می‌شود و نه سفارش یا اقدام مالی انجام می‌دهد.</w:t>
+      </w:r>
+    </w:p>
+    <w:p>
+      <w:pPr>
+        <w:bidi/>
+        <w:spacing w:after="120" w:line="288" w:lineRule="auto"/>
+        <w:jc w:val="right"/>
+      </w:pPr>
+      <w:r>
+        <w:rPr>
+          <w:rFonts w:ascii="Vazirmatn" w:hAnsi="Vazirmatn" w:cs="Vazirmatn"/>
+          <w:b w:val="0"/>
+          <w:color w:val="000000"/>
+          <w:sz w:val="22"/>
+          <w:rtl w:val="1"/>
+        </w:rPr>
+        <w:t>ورودی اختیاری market_board_observation باید نماد منطبق با OHLCV، منبع HTTPS مصوب، زمان Asia/Tehran، واحد قیمت همسان و مقادیر معتبر حجم، میانگین حجم ۲۰روزه، خرید و فروش حقیقی/حقوقی و صف‌ها را داشته باشد. خروجی نسبت حجم به میانگین، خالص حقیقی/حقوقی و وضعیت صف فقط گزارش مشاهده‌ای است، نه توصیهٔ معامله.</w:t>
+      </w:r>
+    </w:p>
+    <w:p>
+      <w:pPr>
+        <w:bidi/>
+        <w:spacing w:after="120" w:line="288" w:lineRule="auto"/>
+        <w:jc w:val="right"/>
+      </w:pPr>
+      <w:r>
+        <w:rPr>
+          <w:rFonts w:ascii="Vazirmatn" w:hAnsi="Vazirmatn" w:cs="Vazirmatn"/>
+          <w:b w:val="0"/>
+          <w:color w:val="000000"/>
+          <w:sz w:val="22"/>
+          <w:rtl w:val="1"/>
+        </w:rPr>
+        <w:t>بازار باز OBSERVED، بازار بسته MARKET_CLOSED و توقف نماد MARKET_SUSPENDED ثبت می‌شود. مشاهدهٔ نامعتبر BOARD_BLOCKED است؛ توقف یا دادهٔ نامعتبر با یافتهٔ قابل‌ردیابی به QA_BLOCKED و DATA_BLOCKED تبدیل می‌شود. نبود مشاهده صرفاً SKIPPED است و اتصال زندهٔ تابلو هنوز ساخته نشده است. قرارداد کامل در agents/market-board.md است.</w:t>
+      </w:r>
+    </w:p>
     <w:sectPr>
       <w:footerReference w:type="default" r:id="rId9"/>
       <w:pgSz w:w="12240" w:h="15840"/>

</xml_diff>